<commit_message>
Updated Week 8 Documenttion
</commit_message>
<xml_diff>
--- a/Week_8/Documentation.docx
+++ b/Week_8/Documentation.docx
@@ -36,7 +36,31 @@
           <w:szCs w:val="24"/>
           <w:u w:val="single"/>
         </w:rPr>
-        <w:t>Churn Prediction Model Development and deployment &amp; MLOps pipeline</w:t>
+        <w:t xml:space="preserve">Churn Prediction Model Development and deployment &amp; </w:t>
+      </w:r>
+      <w:proofErr w:type="spellStart"/>
+      <w:r>
+        <w:rPr>
+          <w:rFonts w:eastAsia="Times New Roman" w:cstheme="minorHAnsi"/>
+          <w:b/>
+          <w:bCs/>
+          <w:sz w:val="24"/>
+          <w:szCs w:val="24"/>
+          <w:u w:val="single"/>
+        </w:rPr>
+        <w:t>MLOps</w:t>
+      </w:r>
+      <w:proofErr w:type="spellEnd"/>
+      <w:r>
+        <w:rPr>
+          <w:rFonts w:eastAsia="Times New Roman" w:cstheme="minorHAnsi"/>
+          <w:b/>
+          <w:bCs/>
+          <w:sz w:val="24"/>
+          <w:szCs w:val="24"/>
+          <w:u w:val="single"/>
+        </w:rPr>
+        <w:t xml:space="preserve"> pipeline</w:t>
       </w:r>
     </w:p>
     <w:p>
@@ -332,8 +356,19 @@
           <w:sz w:val="28"/>
           <w:szCs w:val="28"/>
         </w:rPr>
-        <w:t>Pre-processed dataframe</w:t>
-      </w:r>
+        <w:t xml:space="preserve">Pre-processed </w:t>
+      </w:r>
+      <w:proofErr w:type="spellStart"/>
+      <w:r>
+        <w:rPr>
+          <w:b/>
+          <w:bCs/>
+          <w:sz w:val="28"/>
+          <w:szCs w:val="28"/>
+        </w:rPr>
+        <w:t>dataframe</w:t>
+      </w:r>
+      <w:proofErr w:type="spellEnd"/>
     </w:p>
     <w:p>
       <w:r>
@@ -389,6 +424,9 @@
     <w:p/>
     <w:p>
       <w:r>
+        <w:rPr>
+          <w:noProof/>
+        </w:rPr>
         <w:lastRenderedPageBreak/>
         <w:drawing>
           <wp:inline distT="0" distB="0" distL="0" distR="0" wp14:anchorId="237A9C64" wp14:editId="1D3A0EC7">
@@ -466,6 +504,9 @@
     <w:p/>
     <w:p>
       <w:r>
+        <w:rPr>
+          <w:noProof/>
+        </w:rPr>
         <w:drawing>
           <wp:inline distT="0" distB="0" distL="0" distR="0" wp14:anchorId="70A8DD2C" wp14:editId="68DC6CA5">
             <wp:extent cx="5731510" cy="3303270"/>
@@ -537,6 +578,9 @@
     <w:p/>
     <w:p>
       <w:r>
+        <w:rPr>
+          <w:noProof/>
+        </w:rPr>
         <w:drawing>
           <wp:inline distT="0" distB="0" distL="0" distR="0" wp14:anchorId="06FBC540" wp14:editId="77309357">
             <wp:extent cx="5689257" cy="317500"/>
@@ -606,6 +650,9 @@
     </w:p>
     <w:p>
       <w:r>
+        <w:rPr>
+          <w:noProof/>
+        </w:rPr>
         <w:drawing>
           <wp:inline distT="0" distB="0" distL="0" distR="0" wp14:anchorId="2FB77615" wp14:editId="2C39C8DD">
             <wp:extent cx="5105662" cy="2482978"/>
@@ -692,32 +739,44 @@
           <w:sz w:val="28"/>
           <w:szCs w:val="28"/>
         </w:rPr>
-        <w:t xml:space="preserve"> XGBoost</w:t>
-      </w:r>
-    </w:p>
-    <w:p>
-      <w:pPr>
-        <w:rPr>
-          <w:b/>
-          <w:bCs/>
-          <w:sz w:val="28"/>
-          <w:szCs w:val="28"/>
-        </w:rPr>
-      </w:pPr>
-    </w:p>
-    <w:p>
-      <w:pPr>
-        <w:rPr>
-          <w:b/>
-          <w:bCs/>
-          <w:sz w:val="28"/>
-          <w:szCs w:val="28"/>
-        </w:rPr>
-      </w:pPr>
-      <w:r>
-        <w:rPr>
-          <w:b/>
-          <w:bCs/>
+        <w:t xml:space="preserve"> </w:t>
+      </w:r>
+      <w:proofErr w:type="spellStart"/>
+      <w:r>
+        <w:rPr>
+          <w:b/>
+          <w:bCs/>
+          <w:sz w:val="28"/>
+          <w:szCs w:val="28"/>
+        </w:rPr>
+        <w:t>XGBoost</w:t>
+      </w:r>
+      <w:proofErr w:type="spellEnd"/>
+    </w:p>
+    <w:p>
+      <w:pPr>
+        <w:rPr>
+          <w:b/>
+          <w:bCs/>
+          <w:sz w:val="28"/>
+          <w:szCs w:val="28"/>
+        </w:rPr>
+      </w:pPr>
+    </w:p>
+    <w:p>
+      <w:pPr>
+        <w:rPr>
+          <w:b/>
+          <w:bCs/>
+          <w:sz w:val="28"/>
+          <w:szCs w:val="28"/>
+        </w:rPr>
+      </w:pPr>
+      <w:r>
+        <w:rPr>
+          <w:b/>
+          <w:bCs/>
+          <w:noProof/>
           <w:sz w:val="28"/>
           <w:szCs w:val="28"/>
         </w:rPr>
@@ -784,7 +843,23 @@
           <w:sz w:val="24"/>
           <w:szCs w:val="24"/>
         </w:rPr>
-        <w:t>trained weights and parameters of XGBoost model</w:t>
+        <w:t xml:space="preserve">trained weights and parameters of </w:t>
+      </w:r>
+      <w:proofErr w:type="spellStart"/>
+      <w:r>
+        <w:rPr>
+          <w:sz w:val="24"/>
+          <w:szCs w:val="24"/>
+        </w:rPr>
+        <w:t>XGBoost</w:t>
+      </w:r>
+      <w:proofErr w:type="spellEnd"/>
+      <w:r>
+        <w:rPr>
+          <w:sz w:val="24"/>
+          <w:szCs w:val="24"/>
+        </w:rPr>
+        <w:t xml:space="preserve"> model</w:t>
       </w:r>
       <w:r>
         <w:rPr>
@@ -910,11 +985,34 @@
           <w:szCs w:val="28"/>
         </w:rPr>
         <w:lastRenderedPageBreak/>
-        <w:t>Setting XGBoost hyperparameters</w:t>
-      </w:r>
-    </w:p>
-    <w:p>
-      <w:r>
+        <w:t xml:space="preserve">Setting </w:t>
+      </w:r>
+      <w:proofErr w:type="spellStart"/>
+      <w:r>
+        <w:rPr>
+          <w:b/>
+          <w:bCs/>
+          <w:sz w:val="28"/>
+          <w:szCs w:val="28"/>
+        </w:rPr>
+        <w:t>XGBoost</w:t>
+      </w:r>
+      <w:proofErr w:type="spellEnd"/>
+      <w:r>
+        <w:rPr>
+          <w:b/>
+          <w:bCs/>
+          <w:sz w:val="28"/>
+          <w:szCs w:val="28"/>
+        </w:rPr>
+        <w:t xml:space="preserve"> hyperparameters</w:t>
+      </w:r>
+    </w:p>
+    <w:p>
+      <w:r>
+        <w:rPr>
+          <w:noProof/>
+        </w:rPr>
         <w:drawing>
           <wp:inline distT="0" distB="0" distL="0" distR="0" wp14:anchorId="618BCF60" wp14:editId="4B9F8239">
             <wp:extent cx="2749691" cy="1409772"/>
@@ -958,7 +1056,208 @@
           <w:b/>
           <w:bCs/>
         </w:rPr>
-        <w:t>objective='binary:logistic'</w:t>
+        <w:t>objective='</w:t>
+      </w:r>
+      <w:proofErr w:type="spellStart"/>
+      <w:proofErr w:type="gramStart"/>
+      <w:r>
+        <w:rPr>
+          <w:b/>
+          <w:bCs/>
+        </w:rPr>
+        <w:t>binary:logistic</w:t>
+      </w:r>
+      <w:proofErr w:type="spellEnd"/>
+      <w:proofErr w:type="gramEnd"/>
+      <w:r>
+        <w:rPr>
+          <w:b/>
+          <w:bCs/>
+        </w:rPr>
+        <w:t>':</w:t>
+      </w:r>
+      <w:r>
+        <w:t xml:space="preserve"> </w:t>
+      </w:r>
+      <w:r>
+        <w:t>B</w:t>
+      </w:r>
+      <w:r>
+        <w:rPr>
+          <w:sz w:val="24"/>
+          <w:szCs w:val="24"/>
+        </w:rPr>
+        <w:t>inary classification ( Churn vs. No Churn)</w:t>
+      </w:r>
+      <w:r>
+        <w:rPr>
+          <w:sz w:val="24"/>
+          <w:szCs w:val="24"/>
+        </w:rPr>
+        <w:t>.</w:t>
+      </w:r>
+    </w:p>
+    <w:p>
+      <w:proofErr w:type="spellStart"/>
+      <w:r>
+        <w:rPr>
+          <w:b/>
+          <w:bCs/>
+        </w:rPr>
+        <w:t>num_round</w:t>
+      </w:r>
+      <w:proofErr w:type="spellEnd"/>
+      <w:r>
+        <w:rPr>
+          <w:b/>
+          <w:bCs/>
+        </w:rPr>
+        <w:t>=100:</w:t>
+      </w:r>
+      <w:r>
+        <w:t xml:space="preserve"> </w:t>
+      </w:r>
+      <w:r>
+        <w:rPr>
+          <w:sz w:val="24"/>
+          <w:szCs w:val="24"/>
+        </w:rPr>
+        <w:t>S</w:t>
+      </w:r>
+      <w:r>
+        <w:rPr>
+          <w:sz w:val="24"/>
+          <w:szCs w:val="24"/>
+        </w:rPr>
+        <w:t>pecifies that the model will build exactly 100 trees in total.</w:t>
+      </w:r>
+    </w:p>
+    <w:p>
+      <w:proofErr w:type="spellStart"/>
+      <w:r>
+        <w:rPr>
+          <w:b/>
+          <w:bCs/>
+        </w:rPr>
+        <w:t>max_depth</w:t>
+      </w:r>
+      <w:proofErr w:type="spellEnd"/>
+      <w:r>
+        <w:rPr>
+          <w:b/>
+          <w:bCs/>
+        </w:rPr>
+        <w:t>=5</w:t>
+      </w:r>
+      <w:r>
+        <w:t xml:space="preserve">: </w:t>
+      </w:r>
+      <w:r>
+        <w:rPr>
+          <w:sz w:val="24"/>
+          <w:szCs w:val="24"/>
+        </w:rPr>
+        <w:t>It limits how "deep" each tree can grow. A depth of 5 means each tree can have a maximum of 2^5 = 32 terminal nodes (leaves).</w:t>
+      </w:r>
+    </w:p>
+    <w:p>
+      <w:r>
+        <w:rPr>
+          <w:b/>
+          <w:bCs/>
+        </w:rPr>
+        <w:t>eta=0.2</w:t>
+      </w:r>
+      <w:r>
+        <w:t xml:space="preserve"> </w:t>
+      </w:r>
+      <w:r>
+        <w:rPr>
+          <w:sz w:val="24"/>
+          <w:szCs w:val="24"/>
+        </w:rPr>
+        <w:t>(Learning Rate): step size</w:t>
+      </w:r>
+    </w:p>
+    <w:p>
+      <w:pPr>
+        <w:rPr>
+          <w:sz w:val="24"/>
+          <w:szCs w:val="24"/>
+        </w:rPr>
+      </w:pPr>
+      <w:r>
+        <w:rPr>
+          <w:b/>
+          <w:bCs/>
+        </w:rPr>
+        <w:t>subsample=0.8</w:t>
+      </w:r>
+      <w:r>
+        <w:t xml:space="preserve">: </w:t>
+      </w:r>
+      <w:r>
+        <w:rPr>
+          <w:sz w:val="24"/>
+          <w:szCs w:val="24"/>
+        </w:rPr>
+        <w:t xml:space="preserve">For every tree, </w:t>
+      </w:r>
+      <w:proofErr w:type="spellStart"/>
+      <w:r>
+        <w:rPr>
+          <w:sz w:val="24"/>
+          <w:szCs w:val="24"/>
+        </w:rPr>
+        <w:t>XGBoost</w:t>
+      </w:r>
+      <w:proofErr w:type="spellEnd"/>
+      <w:r>
+        <w:rPr>
+          <w:sz w:val="24"/>
+          <w:szCs w:val="24"/>
+        </w:rPr>
+        <w:t xml:space="preserve"> will randomly select 80% of training rows to build that specific tree.</w:t>
+      </w:r>
+    </w:p>
+    <w:p>
+      <w:pPr>
+        <w:rPr>
+          <w:sz w:val="24"/>
+          <w:szCs w:val="24"/>
+        </w:rPr>
+      </w:pPr>
+      <w:proofErr w:type="spellStart"/>
+      <w:r>
+        <w:rPr>
+          <w:b/>
+          <w:bCs/>
+        </w:rPr>
+        <w:t>eval_metric</w:t>
+      </w:r>
+      <w:proofErr w:type="spellEnd"/>
+      <w:r>
+        <w:rPr>
+          <w:b/>
+          <w:bCs/>
+        </w:rPr>
+        <w:t>='</w:t>
+      </w:r>
+      <w:proofErr w:type="spellStart"/>
+      <w:r>
+        <w:rPr>
+          <w:b/>
+          <w:bCs/>
+        </w:rPr>
+        <w:t>auc</w:t>
+      </w:r>
+      <w:proofErr w:type="spellEnd"/>
+      <w:r>
+        <w:rPr>
+          <w:b/>
+          <w:bCs/>
+        </w:rPr>
+        <w:t>'</w:t>
       </w:r>
       <w:r>
         <w:rPr>
@@ -968,42 +1267,39 @@
         <w:t>:</w:t>
       </w:r>
       <w:r>
+        <w:rPr>
+          <w:b/>
+          <w:bCs/>
+        </w:rPr>
         <w:t xml:space="preserve"> </w:t>
       </w:r>
       <w:r>
-        <w:t>B</w:t>
-      </w:r>
-      <w:r>
-        <w:rPr>
-          <w:sz w:val="24"/>
-          <w:szCs w:val="24"/>
-        </w:rPr>
-        <w:t>inary classification ( Churn vs. No Churn)</w:t>
-      </w:r>
-      <w:r>
-        <w:rPr>
-          <w:sz w:val="24"/>
-          <w:szCs w:val="24"/>
-        </w:rPr>
-        <w:t>.</w:t>
-      </w:r>
-    </w:p>
-    <w:p>
-      <w:r>
-        <w:rPr>
-          <w:b/>
-          <w:bCs/>
-        </w:rPr>
-        <w:t>num_round=100</w:t>
-      </w:r>
-      <w:r>
-        <w:rPr>
-          <w:b/>
-          <w:bCs/>
-        </w:rPr>
-        <w:t>:</w:t>
-      </w:r>
-      <w:r>
+        <w:rPr>
+          <w:sz w:val="24"/>
+          <w:szCs w:val="24"/>
+        </w:rPr>
+        <w:t>It calculates the Area Under the ROC Curve (AUC).</w:t>
+      </w:r>
+    </w:p>
+    <w:p>
+      <w:pPr>
+        <w:rPr>
+          <w:sz w:val="24"/>
+          <w:szCs w:val="24"/>
+        </w:rPr>
+      </w:pPr>
+      <w:r>
+        <w:rPr>
+          <w:sz w:val="24"/>
+          <w:szCs w:val="24"/>
+        </w:rPr>
+        <w:t>AUC measures how well the model separates the two classes across all probability thresholds.</w:t>
+      </w:r>
+      <w:r>
+        <w:rPr>
+          <w:sz w:val="24"/>
+          <w:szCs w:val="24"/>
+        </w:rPr>
         <w:t xml:space="preserve"> </w:t>
       </w:r>
       <w:r>
@@ -1011,182 +1307,15 @@
           <w:sz w:val="24"/>
           <w:szCs w:val="24"/>
         </w:rPr>
-        <w:t>S</w:t>
-      </w:r>
-      <w:r>
-        <w:rPr>
-          <w:sz w:val="24"/>
-          <w:szCs w:val="24"/>
-        </w:rPr>
-        <w:t>pecifies that the model will build exactly 100 trees in total.</w:t>
-      </w:r>
-    </w:p>
-    <w:p>
-      <w:r>
-        <w:rPr>
-          <w:b/>
-          <w:bCs/>
-        </w:rPr>
-        <w:t>max_depth=5</w:t>
-      </w:r>
-      <w:r>
-        <w:t xml:space="preserve">: </w:t>
-      </w:r>
-      <w:r>
-        <w:rPr>
-          <w:sz w:val="24"/>
-          <w:szCs w:val="24"/>
-        </w:rPr>
-        <w:t>It limits how "deep" each tree can grow. A depth of 5 means each tree can have a maximum of 2^5 = 32 terminal nodes (leaves).</w:t>
-      </w:r>
-    </w:p>
-    <w:p>
-      <w:r>
-        <w:rPr>
-          <w:b/>
-          <w:bCs/>
-        </w:rPr>
-        <w:t>eta=0.2</w:t>
-      </w:r>
-      <w:r>
-        <w:t xml:space="preserve"> </w:t>
-      </w:r>
-      <w:r>
-        <w:rPr>
-          <w:sz w:val="24"/>
-          <w:szCs w:val="24"/>
-        </w:rPr>
-        <w:t>(Learning Rate)</w:t>
-      </w:r>
-      <w:r>
-        <w:rPr>
-          <w:sz w:val="24"/>
-          <w:szCs w:val="24"/>
-        </w:rPr>
-        <w:t xml:space="preserve">: </w:t>
-      </w:r>
-      <w:r>
-        <w:rPr>
-          <w:sz w:val="24"/>
-          <w:szCs w:val="24"/>
-        </w:rPr>
-        <w:t>step size</w:t>
-      </w:r>
-    </w:p>
-    <w:p>
-      <w:pPr>
-        <w:rPr>
-          <w:sz w:val="24"/>
-          <w:szCs w:val="24"/>
-        </w:rPr>
-      </w:pPr>
-      <w:r>
-        <w:rPr>
-          <w:b/>
-          <w:bCs/>
-        </w:rPr>
-        <w:t>subsample=0.8</w:t>
-      </w:r>
-      <w:r>
-        <w:t xml:space="preserve">: </w:t>
-      </w:r>
-      <w:r>
-        <w:rPr>
-          <w:sz w:val="24"/>
-          <w:szCs w:val="24"/>
-        </w:rPr>
-        <w:t>For every tree, XGBoost will randomly select 80% of training rows to build that specific tree.</w:t>
-      </w:r>
-    </w:p>
-    <w:p>
-      <w:pPr>
-        <w:rPr>
-          <w:sz w:val="24"/>
-          <w:szCs w:val="24"/>
-        </w:rPr>
-      </w:pPr>
-      <w:r>
-        <w:rPr>
-          <w:b/>
-          <w:bCs/>
-        </w:rPr>
-        <w:t>eval_metric='auc'</w:t>
-      </w:r>
-      <w:r>
-        <w:rPr>
-          <w:b/>
-          <w:bCs/>
-        </w:rPr>
-        <w:t>:</w:t>
-      </w:r>
-      <w:r>
-        <w:rPr>
-          <w:b/>
-          <w:bCs/>
-        </w:rPr>
-        <w:t xml:space="preserve"> </w:t>
-      </w:r>
-      <w:r>
-        <w:rPr>
-          <w:sz w:val="24"/>
-          <w:szCs w:val="24"/>
-        </w:rPr>
-        <w:t>It</w:t>
-      </w:r>
-      <w:r>
-        <w:rPr>
-          <w:sz w:val="24"/>
-          <w:szCs w:val="24"/>
-        </w:rPr>
-        <w:t xml:space="preserve"> calculates the Area Under the ROC Curve (AUC).</w:t>
-      </w:r>
-    </w:p>
-    <w:p>
-      <w:pPr>
-        <w:rPr>
-          <w:sz w:val="24"/>
-          <w:szCs w:val="24"/>
-        </w:rPr>
-      </w:pPr>
-      <w:r>
-        <w:rPr>
-          <w:sz w:val="24"/>
-          <w:szCs w:val="24"/>
-        </w:rPr>
-        <w:t>AUC measures how well the model separates the two classes across all probability thresholds</w:t>
-      </w:r>
-      <w:r>
-        <w:rPr>
-          <w:sz w:val="24"/>
-          <w:szCs w:val="24"/>
-        </w:rPr>
-        <w:t>.</w:t>
-      </w:r>
-      <w:r>
-        <w:rPr>
-          <w:sz w:val="24"/>
-          <w:szCs w:val="24"/>
-        </w:rPr>
-        <w:t xml:space="preserve"> </w:t>
-      </w:r>
-      <w:r>
-        <w:rPr>
-          <w:sz w:val="24"/>
-          <w:szCs w:val="24"/>
-        </w:rPr>
-        <w:t xml:space="preserve">It </w:t>
-      </w:r>
-      <w:r>
-        <w:rPr>
-          <w:sz w:val="24"/>
-          <w:szCs w:val="24"/>
-        </w:rPr>
-        <w:t>distinguishes between customers who will leave (churn) and those who will stay (retain).</w:t>
+        <w:t>It distinguishes between customers who will leave (churn) and those who will stay (retain).</w:t>
       </w:r>
     </w:p>
     <w:p/>
     <w:p>
       <w:r>
+        <w:rPr>
+          <w:noProof/>
+        </w:rPr>
         <w:drawing>
           <wp:inline distT="0" distB="0" distL="0" distR="0" wp14:anchorId="621A2DD9" wp14:editId="215DB7D3">
             <wp:extent cx="3283119" cy="1759040"/>
@@ -1250,7 +1379,23 @@
           <w:sz w:val="24"/>
           <w:szCs w:val="24"/>
         </w:rPr>
-        <w:t xml:space="preserve">Training auc keeps increasing while </w:t>
+        <w:t xml:space="preserve">Training </w:t>
+      </w:r>
+      <w:proofErr w:type="spellStart"/>
+      <w:r>
+        <w:rPr>
+          <w:sz w:val="24"/>
+          <w:szCs w:val="24"/>
+        </w:rPr>
+        <w:t>auc</w:t>
+      </w:r>
+      <w:proofErr w:type="spellEnd"/>
+      <w:r>
+        <w:rPr>
+          <w:sz w:val="24"/>
+          <w:szCs w:val="24"/>
+        </w:rPr>
+        <w:t xml:space="preserve"> keeps increasing while </w:t>
       </w:r>
       <w:r>
         <w:rPr>
@@ -1264,8 +1409,33 @@
           <w:sz w:val="24"/>
           <w:szCs w:val="24"/>
         </w:rPr>
-        <w:t>al auc keeps descreasing</w:t>
-      </w:r>
+        <w:t xml:space="preserve">al </w:t>
+      </w:r>
+      <w:proofErr w:type="spellStart"/>
+      <w:r>
+        <w:rPr>
+          <w:sz w:val="24"/>
+          <w:szCs w:val="24"/>
+        </w:rPr>
+        <w:t>auc</w:t>
+      </w:r>
+      <w:proofErr w:type="spellEnd"/>
+      <w:r>
+        <w:rPr>
+          <w:sz w:val="24"/>
+          <w:szCs w:val="24"/>
+        </w:rPr>
+        <w:t xml:space="preserve"> keeps </w:t>
+      </w:r>
+      <w:proofErr w:type="spellStart"/>
+      <w:r>
+        <w:rPr>
+          <w:sz w:val="24"/>
+          <w:szCs w:val="24"/>
+        </w:rPr>
+        <w:t>descreasing</w:t>
+      </w:r>
+      <w:proofErr w:type="spellEnd"/>
       <w:r>
         <w:rPr>
           <w:sz w:val="24"/>
@@ -1277,6 +1447,9 @@
     <w:p/>
     <w:p>
       <w:r>
+        <w:rPr>
+          <w:noProof/>
+        </w:rPr>
         <w:lastRenderedPageBreak/>
         <w:drawing>
           <wp:inline distT="0" distB="0" distL="0" distR="0" wp14:anchorId="5B960408" wp14:editId="2525A05E">
@@ -1343,6 +1516,9 @@
     </w:p>
     <w:p>
       <w:r>
+        <w:rPr>
+          <w:noProof/>
+        </w:rPr>
         <w:drawing>
           <wp:inline distT="0" distB="0" distL="0" distR="0" wp14:anchorId="1723DE91" wp14:editId="561E248F">
             <wp:extent cx="3359323" cy="3067208"/>
@@ -1406,7 +1582,53 @@
       </w:r>
     </w:p>
     <w:p>
-      <w:r>
+      <w:pPr>
+        <w:rPr>
+          <w:sz w:val="24"/>
+          <w:szCs w:val="24"/>
+        </w:rPr>
+      </w:pPr>
+      <w:r>
+        <w:rPr>
+          <w:sz w:val="24"/>
+          <w:szCs w:val="24"/>
+        </w:rPr>
+        <w:t>Setting threshold =</w:t>
+      </w:r>
+      <w:r>
+        <w:rPr>
+          <w:sz w:val="24"/>
+          <w:szCs w:val="24"/>
+        </w:rPr>
+        <w:t xml:space="preserve"> </w:t>
+      </w:r>
+      <w:r>
+        <w:rPr>
+          <w:sz w:val="24"/>
+          <w:szCs w:val="24"/>
+        </w:rPr>
+        <w:t>0.3 to capture more churners</w:t>
+      </w:r>
+      <w:r>
+        <w:rPr>
+          <w:sz w:val="24"/>
+          <w:szCs w:val="24"/>
+        </w:rPr>
+        <w:t>.</w:t>
+      </w:r>
+      <w:r>
+        <w:rPr>
+          <w:sz w:val="24"/>
+          <w:szCs w:val="24"/>
+        </w:rPr>
+        <w:t xml:space="preserve"> </w:t>
+      </w:r>
+    </w:p>
+    <w:p>
+      <w:r>
+        <w:rPr>
+          <w:noProof/>
+        </w:rPr>
         <w:drawing>
           <wp:inline distT="0" distB="0" distL="0" distR="0" wp14:anchorId="4FBA6073" wp14:editId="5065E929">
             <wp:extent cx="5731510" cy="384175"/>
@@ -1446,6 +1668,9 @@
     </w:p>
     <w:p>
       <w:r>
+        <w:rPr>
+          <w:noProof/>
+        </w:rPr>
         <w:drawing>
           <wp:inline distT="0" distB="0" distL="0" distR="0" wp14:anchorId="7452B4F4" wp14:editId="595A7CA8">
             <wp:extent cx="3751521" cy="2209800"/>
@@ -1524,16 +1749,6 @@
         </w:rPr>
         <w:t>AUC – ROC Curve</w:t>
       </w:r>
-    </w:p>
-    <w:p>
-      <w:pPr>
-        <w:rPr>
-          <w:b/>
-          <w:bCs/>
-          <w:sz w:val="28"/>
-          <w:szCs w:val="28"/>
-        </w:rPr>
-      </w:pPr>
     </w:p>
     <w:p>
       <w:pPr>
@@ -1631,43 +1846,36 @@
     <w:p>
       <w:pPr>
         <w:rPr>
-          <w:sz w:val="24"/>
-          <w:szCs w:val="24"/>
-        </w:rPr>
-      </w:pPr>
-    </w:p>
-    <w:p>
-      <w:pPr>
-        <w:rPr>
-          <w:b/>
-          <w:bCs/>
-          <w:sz w:val="28"/>
-          <w:szCs w:val="28"/>
-        </w:rPr>
-      </w:pPr>
-      <w:r>
-        <w:rPr>
-          <w:b/>
-          <w:bCs/>
-          <w:sz w:val="28"/>
-          <w:szCs w:val="28"/>
+          <w:b/>
+          <w:bCs/>
+          <w:sz w:val="28"/>
+          <w:szCs w:val="28"/>
+        </w:rPr>
+      </w:pPr>
+      <w:r>
+        <w:rPr>
+          <w:b/>
+          <w:bCs/>
+          <w:sz w:val="28"/>
+          <w:szCs w:val="28"/>
+        </w:rPr>
+        <w:t>Model Registration</w:t>
+      </w:r>
+    </w:p>
+    <w:p>
+      <w:pPr>
+        <w:rPr>
+          <w:sz w:val="24"/>
+          <w:szCs w:val="24"/>
+        </w:rPr>
+      </w:pPr>
+      <w:r>
+        <w:rPr>
+          <w:noProof/>
+          <w:sz w:val="24"/>
+          <w:szCs w:val="24"/>
         </w:rPr>
         <w:lastRenderedPageBreak/>
-        <w:t>Model Registration</w:t>
-      </w:r>
-    </w:p>
-    <w:p>
-      <w:pPr>
-        <w:rPr>
-          <w:sz w:val="24"/>
-          <w:szCs w:val="24"/>
-        </w:rPr>
-      </w:pPr>
-      <w:r>
-        <w:rPr>
-          <w:sz w:val="24"/>
-          <w:szCs w:val="24"/>
-        </w:rPr>
         <w:drawing>
           <wp:inline distT="0" distB="0" distL="0" distR="0" wp14:anchorId="6E92A22D" wp14:editId="63E7AADA">
             <wp:extent cx="5731510" cy="3389630"/>
@@ -1722,6 +1930,7 @@
       </w:pPr>
       <w:r>
         <w:rPr>
+          <w:noProof/>
           <w:sz w:val="24"/>
           <w:szCs w:val="24"/>
         </w:rPr>
@@ -2375,6 +2584,7 @@
   <w:style w:type="character" w:default="1" w:styleId="DefaultParagraphFont">
     <w:name w:val="Default Paragraph Font"/>
     <w:uiPriority w:val="1"/>
+    <w:semiHidden/>
     <w:unhideWhenUsed/>
   </w:style>
   <w:style w:type="table" w:default="1" w:styleId="TableNormal">

</xml_diff>